<commit_message>
Obrazac 6 as PDF, matching the Word layout
- New "Generiši Obrazac 6 (PDF)" button next to the .docx one; the PDF is
  built in the browser from the same filled .docx (docx-preview ->
  html2canvas -> jsPDF, loaded from CDN on first click)
- Rendering is isolated in an iframe and tuned to match Word: line
  spacing, paragraph font, no kerning, row alignment, tab stops,
  signature images placed whole on their page
- Pages break between table rows (a row is split only if it is taller
  than a page), with a line closing the table at the page bottom and
  opening it on the next page
- Template: every cell of the main table now has a bottom border, so
  Word also draws the line when the table continues on the next page
- Template fetch and app.js are versioned to avoid stale browser caches

Co-Authored-By: Claude Opus 5.5 <noreply@anthropic.com>
</commit_message>
<xml_diff>
--- a/templates/obrazac6-template.docx
+++ b/templates/obrazac6-template.docx
@@ -184,6 +184,7 @@
             <w:tcBorders>
               <w:top w:val="single" w:sz="4" w:space="0" w:color="auto"/>
               <w:left w:val="single" w:sz="4" w:space="0" w:color="auto"/>
+              <w:bottom w:val="single" w:sz="4" w:space="0" w:color="auto"/>
             </w:tcBorders>
             <w:shd w:val="clear" w:color="auto" w:fill="auto"/>
             <w:vAlign w:val="center"/>
@@ -231,6 +232,7 @@
             <w:tcBorders>
               <w:top w:val="single" w:sz="4" w:space="0" w:color="auto"/>
               <w:left w:val="single" w:sz="4" w:space="0" w:color="auto"/>
+              <w:bottom w:val="single" w:sz="4" w:space="0" w:color="auto"/>
               <w:right w:val="single" w:sz="4" w:space="0" w:color="auto"/>
             </w:tcBorders>
             <w:shd w:val="clear" w:color="auto" w:fill="auto"/>
@@ -270,6 +272,7 @@
             <w:tcBorders>
               <w:top w:val="single" w:sz="4" w:space="0" w:color="auto"/>
               <w:left w:val="single" w:sz="4" w:space="0" w:color="auto"/>
+              <w:bottom w:val="single" w:sz="4" w:space="0" w:color="auto"/>
             </w:tcBorders>
             <w:shd w:val="clear" w:color="auto" w:fill="auto"/>
             <w:vAlign w:val="center"/>
@@ -301,6 +304,7 @@
             <w:tcBorders>
               <w:top w:val="single" w:sz="4" w:space="0" w:color="auto"/>
               <w:left w:val="single" w:sz="4" w:space="0" w:color="auto"/>
+              <w:bottom w:val="single" w:sz="4" w:space="0" w:color="auto"/>
               <w:right w:val="single" w:sz="4" w:space="0" w:color="auto"/>
             </w:tcBorders>
             <w:shd w:val="clear" w:color="auto" w:fill="auto"/>
@@ -340,6 +344,7 @@
             <w:tcBorders>
               <w:top w:val="single" w:sz="4" w:space="0" w:color="auto"/>
               <w:left w:val="single" w:sz="4" w:space="0" w:color="auto"/>
+              <w:bottom w:val="single" w:sz="4" w:space="0" w:color="auto"/>
             </w:tcBorders>
             <w:shd w:val="clear" w:color="auto" w:fill="auto"/>
             <w:vAlign w:val="center"/>
@@ -371,6 +376,7 @@
             <w:tcBorders>
               <w:top w:val="single" w:sz="4" w:space="0" w:color="auto"/>
               <w:left w:val="single" w:sz="4" w:space="0" w:color="auto"/>
+              <w:bottom w:val="single" w:sz="4" w:space="0" w:color="auto"/>
               <w:right w:val="single" w:sz="4" w:space="0" w:color="auto"/>
             </w:tcBorders>
             <w:shd w:val="clear" w:color="auto" w:fill="auto"/>
@@ -408,6 +414,7 @@
             <w:tcBorders>
               <w:top w:val="single" w:sz="4" w:space="0" w:color="auto"/>
               <w:left w:val="single" w:sz="4" w:space="0" w:color="auto"/>
+              <w:bottom w:val="single" w:sz="4" w:space="0" w:color="auto"/>
             </w:tcBorders>
             <w:shd w:val="clear" w:color="auto" w:fill="auto"/>
           </w:tcPr>
@@ -437,6 +444,7 @@
             <w:tcBorders>
               <w:top w:val="single" w:sz="4" w:space="0" w:color="auto"/>
               <w:left w:val="single" w:sz="4" w:space="0" w:color="auto"/>
+              <w:bottom w:val="single" w:sz="4" w:space="0" w:color="auto"/>
               <w:right w:val="single" w:sz="4" w:space="0" w:color="auto"/>
             </w:tcBorders>
             <w:shd w:val="clear" w:color="auto" w:fill="auto"/>
@@ -475,6 +483,7 @@
             <w:tcBorders>
               <w:top w:val="single" w:sz="4" w:space="0" w:color="auto"/>
               <w:left w:val="single" w:sz="4" w:space="0" w:color="auto"/>
+              <w:bottom w:val="single" w:sz="4" w:space="0" w:color="auto"/>
             </w:tcBorders>
             <w:shd w:val="clear" w:color="auto" w:fill="auto"/>
             <w:vAlign w:val="center"/>
@@ -506,6 +515,7 @@
             <w:tcBorders>
               <w:top w:val="single" w:sz="4" w:space="0" w:color="auto"/>
               <w:left w:val="single" w:sz="4" w:space="0" w:color="auto"/>
+              <w:bottom w:val="single" w:sz="4" w:space="0" w:color="auto"/>
               <w:right w:val="single" w:sz="4" w:space="0" w:color="auto"/>
             </w:tcBorders>
             <w:shd w:val="clear" w:color="auto" w:fill="auto"/>
@@ -542,6 +552,7 @@
             <w:tcBorders>
               <w:top w:val="single" w:sz="4" w:space="0" w:color="auto"/>
               <w:left w:val="single" w:sz="4" w:space="0" w:color="auto"/>
+              <w:bottom w:val="single" w:sz="4" w:space="0" w:color="auto"/>
             </w:tcBorders>
             <w:shd w:val="clear" w:color="auto" w:fill="auto"/>
             <w:vAlign w:val="center"/>
@@ -572,6 +583,7 @@
             <w:tcBorders>
               <w:top w:val="single" w:sz="4" w:space="0" w:color="auto"/>
               <w:left w:val="single" w:sz="4" w:space="0" w:color="auto"/>
+              <w:bottom w:val="single" w:sz="4" w:space="0" w:color="auto"/>
             </w:tcBorders>
             <w:shd w:val="clear" w:color="auto" w:fill="auto"/>
             <w:vAlign w:val="center"/>
@@ -602,6 +614,7 @@
             <w:tcBorders>
               <w:top w:val="single" w:sz="4" w:space="0" w:color="auto"/>
               <w:left w:val="single" w:sz="4" w:space="0" w:color="auto"/>
+              <w:bottom w:val="single" w:sz="4" w:space="0" w:color="auto"/>
             </w:tcBorders>
             <w:shd w:val="clear" w:color="auto" w:fill="auto"/>
             <w:vAlign w:val="center"/>
@@ -632,6 +645,7 @@
             <w:tcBorders>
               <w:top w:val="single" w:sz="4" w:space="0" w:color="auto"/>
               <w:left w:val="single" w:sz="4" w:space="0" w:color="auto"/>
+              <w:bottom w:val="single" w:sz="4" w:space="0" w:color="auto"/>
               <w:right w:val="single" w:sz="4" w:space="0" w:color="auto"/>
             </w:tcBorders>
             <w:shd w:val="clear" w:color="auto" w:fill="auto"/>
@@ -669,6 +683,7 @@
             <w:tcBorders>
               <w:top w:val="single" w:sz="4" w:space="0" w:color="auto"/>
               <w:left w:val="single" w:sz="4" w:space="0" w:color="auto"/>
+              <w:bottom w:val="single" w:sz="4" w:space="0" w:color="auto"/>
             </w:tcBorders>
             <w:shd w:val="clear" w:color="auto" w:fill="auto"/>
             <w:vAlign w:val="center"/>
@@ -699,6 +714,7 @@
             <w:tcBorders>
               <w:top w:val="single" w:sz="4" w:space="0" w:color="auto"/>
               <w:left w:val="single" w:sz="4" w:space="0" w:color="auto"/>
+              <w:bottom w:val="single" w:sz="4" w:space="0" w:color="auto"/>
             </w:tcBorders>
             <w:shd w:val="clear" w:color="auto" w:fill="auto"/>
           </w:tcPr>
@@ -728,6 +744,7 @@
             <w:tcBorders>
               <w:top w:val="single" w:sz="4" w:space="0" w:color="auto"/>
               <w:left w:val="single" w:sz="4" w:space="0" w:color="auto"/>
+              <w:bottom w:val="single" w:sz="4" w:space="0" w:color="auto"/>
             </w:tcBorders>
             <w:shd w:val="clear" w:color="auto" w:fill="auto"/>
           </w:tcPr>
@@ -757,6 +774,7 @@
             <w:tcBorders>
               <w:top w:val="single" w:sz="4" w:space="0" w:color="auto"/>
               <w:left w:val="single" w:sz="4" w:space="0" w:color="auto"/>
+              <w:bottom w:val="single" w:sz="4" w:space="0" w:color="auto"/>
               <w:right w:val="single" w:sz="4" w:space="0" w:color="auto"/>
             </w:tcBorders>
             <w:shd w:val="clear" w:color="auto" w:fill="auto"/>
@@ -794,6 +812,7 @@
             <w:tcBorders>
               <w:top w:val="single" w:sz="4" w:space="0" w:color="auto"/>
               <w:left w:val="single" w:sz="4" w:space="0" w:color="auto"/>
+              <w:bottom w:val="single" w:sz="4" w:space="0" w:color="auto"/>
             </w:tcBorders>
             <w:shd w:val="clear" w:color="auto" w:fill="auto"/>
             <w:vAlign w:val="bottom"/>
@@ -842,6 +861,7 @@
             <w:tcBorders>
               <w:top w:val="single" w:sz="4" w:space="0" w:color="auto"/>
               <w:left w:val="single" w:sz="4" w:space="0" w:color="auto"/>
+              <w:bottom w:val="single" w:sz="4" w:space="0" w:color="auto"/>
               <w:right w:val="single" w:sz="4" w:space="0" w:color="auto"/>
             </w:tcBorders>
             <w:shd w:val="clear" w:color="auto" w:fill="auto"/>
@@ -879,6 +899,7 @@
             <w:tcBorders>
               <w:top w:val="single" w:sz="4" w:space="0" w:color="auto"/>
               <w:left w:val="single" w:sz="4" w:space="0" w:color="auto"/>
+              <w:bottom w:val="single" w:sz="4" w:space="0" w:color="auto"/>
             </w:tcBorders>
             <w:shd w:val="clear" w:color="auto" w:fill="auto"/>
             <w:vAlign w:val="center"/>
@@ -909,6 +930,7 @@
             <w:tcBorders>
               <w:top w:val="single" w:sz="4" w:space="0" w:color="auto"/>
               <w:left w:val="single" w:sz="4" w:space="0" w:color="auto"/>
+              <w:bottom w:val="single" w:sz="4" w:space="0" w:color="auto"/>
               <w:right w:val="single" w:sz="4" w:space="0" w:color="auto"/>
             </w:tcBorders>
             <w:shd w:val="clear" w:color="auto" w:fill="auto"/>
@@ -946,6 +968,7 @@
             <w:tcBorders>
               <w:top w:val="single" w:sz="4" w:space="0" w:color="auto"/>
               <w:left w:val="single" w:sz="4" w:space="0" w:color="auto"/>
+              <w:bottom w:val="single" w:sz="4" w:space="0" w:color="auto"/>
             </w:tcBorders>
             <w:shd w:val="clear" w:color="auto" w:fill="auto"/>
             <w:vAlign w:val="center"/>
@@ -994,6 +1017,7 @@
             <w:tcBorders>
               <w:top w:val="single" w:sz="4" w:space="0" w:color="auto"/>
               <w:left w:val="single" w:sz="4" w:space="0" w:color="auto"/>
+              <w:bottom w:val="single" w:sz="4" w:space="0" w:color="auto"/>
               <w:right w:val="single" w:sz="4" w:space="0" w:color="auto"/>
             </w:tcBorders>
             <w:shd w:val="clear" w:color="auto" w:fill="auto"/>
@@ -1029,6 +1053,7 @@
             <w:tcBorders>
               <w:top w:val="single" w:sz="4" w:space="0" w:color="auto"/>
               <w:left w:val="single" w:sz="4" w:space="0" w:color="auto"/>
+              <w:bottom w:val="single" w:sz="4" w:space="0" w:color="auto"/>
             </w:tcBorders>
             <w:shd w:val="clear" w:color="auto" w:fill="auto"/>
             <w:vAlign w:val="center"/>
@@ -1060,6 +1085,7 @@
             <w:tcBorders>
               <w:top w:val="single" w:sz="4" w:space="0" w:color="auto"/>
               <w:left w:val="single" w:sz="4" w:space="0" w:color="auto"/>
+              <w:bottom w:val="single" w:sz="4" w:space="0" w:color="auto"/>
               <w:right w:val="single" w:sz="4" w:space="0" w:color="auto"/>
             </w:tcBorders>
             <w:shd w:val="clear" w:color="auto" w:fill="auto"/>

</xml_diff>